<commit_message>
Data use agreement: formal wording, signed by the recipient only
Co-Authored-By: Claude Opus 5.5 (1M context) <noreply@anthropic.com>
</commit_message>
<xml_diff>
--- a/WashiMMKG_Data_Use_Agreement.docx
+++ b/WashiMMKG_Data_Use_Agreement.docx
@@ -4,25 +4,41 @@
   <w:body>
     <w:p>
       <w:pPr>
-        <w:pStyle w:val="Title"/>
+        <w:spacing w:before="0" w:after="40" w:line="276" w:lineRule="auto"/>
         <w:jc w:val="center"/>
       </w:pPr>
       <w:r>
-        <w:t>WashiMMKG Data Use Agreement</w:t>
+        <w:rPr>
+          <w:b/>
+          <w:i w:val="0"/>
+          <w:caps w:val="0"/>
+          <w:sz w:val="32"/>
+        </w:rPr>
+        <w:t>DATA USE AGREEMENT</w:t>
       </w:r>
     </w:p>
     <w:p>
       <w:pPr>
-        <w:spacing w:after="120"/>
+        <w:spacing w:before="0" w:after="360" w:line="276" w:lineRule="auto"/>
+        <w:jc w:val="center"/>
       </w:pPr>
       <w:r>
         <w:rPr>
-          <w:b/>
+          <w:b w:val="0"/>
+          <w:i w:val="0"/>
+          <w:caps w:val="0"/>
+          <w:sz w:val="24"/>
         </w:rPr>
-        <w:t>Dataset:</w:t>
+        <w:t>WashiMMKG Knowledge Graph and Washi QA Benchmark</w:t>
       </w:r>
+    </w:p>
+    <w:p>
+      <w:pPr>
+        <w:spacing w:before="0" w:after="160" w:line="276" w:lineRule="auto"/>
+        <w:jc w:val="both"/>
+      </w:pPr>
       <w:r>
-        <w:t xml:space="preserve"> WashiMMKG and the Washi QA benchmark, as described in </w:t>
+        <w:t>This Data Use Agreement (the “Agreement”) is entered into by the authors of the article “</w:t>
       </w:r>
       <w:r>
         <w:rPr>
@@ -31,523 +47,945 @@
         <w:t>Enhancing Washi Reasoning in MLLMs via Multimodal Knowledge Graphs and Agentic Retrieval-Augmented Generation</w:t>
       </w:r>
       <w:r>
-        <w:t xml:space="preserve"> (npj Heritage Science).</w:t>
+        <w:t>”, published in npj Heritage Science (the “Publication”), represented by the corresponding author, Bowen Wang, SANKEN, The University of Osaka (the “Data Provider”), and the person identified in the Recipient Information below (the “Recipient”).</w:t>
       </w:r>
     </w:p>
     <w:p>
       <w:pPr>
-        <w:spacing w:after="120"/>
+        <w:spacing w:before="0" w:after="200" w:line="276" w:lineRule="auto"/>
+        <w:jc w:val="both"/>
+      </w:pPr>
+      <w:r>
+        <w:rPr>
+          <w:b w:val="0"/>
+          <w:i w:val="0"/>
+          <w:caps w:val="0"/>
+        </w:rPr>
+        <w:t>In consideration of being granted access to the Dataset, the Recipient agrees as follows.</w:t>
+      </w:r>
+    </w:p>
+    <w:p>
+      <w:pPr>
+        <w:spacing w:before="160" w:after="80" w:line="276" w:lineRule="auto"/>
+        <w:jc w:val="left"/>
       </w:pPr>
       <w:r>
         <w:rPr>
           <w:b/>
+          <w:i w:val="0"/>
+          <w:caps w:val="0"/>
         </w:rPr>
-        <w:t>Provider:</w:t>
-      </w:r>
-      <w:r>
-        <w:t xml:space="preserve"> Bowen Wang, SANKEN, The University of Osaka, on behalf of the authors ("the Provider").</w:t>
+        <w:t>Article 1   Definitions</w:t>
       </w:r>
     </w:p>
     <w:p>
       <w:pPr>
-        <w:spacing w:after="120"/>
+        <w:tabs>
+          <w:tab w:pos="567" w:val="left"/>
+        </w:tabs>
+        <w:spacing w:before="0" w:after="80" w:line="276" w:lineRule="auto"/>
+        <w:ind w:left="567" w:hanging="567"/>
+        <w:jc w:val="both"/>
+      </w:pPr>
+      <w:r>
+        <w:t>1.1</w:t>
+        <w:tab/>
+        <w:t>In this Agreement, the following terms have the meanings set out below.</w:t>
+      </w:r>
+    </w:p>
+    <w:p>
+      <w:pPr>
+        <w:tabs>
+          <w:tab w:pos="567" w:val="left"/>
+        </w:tabs>
+        <w:spacing w:before="0" w:after="80" w:line="276" w:lineRule="auto"/>
+        <w:ind w:left="567" w:hanging="567"/>
+        <w:jc w:val="both"/>
+      </w:pPr>
+      <w:r>
+        <w:t>1.2</w:t>
+        <w:tab/>
+        <w:t>“Dataset” means the WashiMMKG knowledge graph (2,683 entities, 5,276 relations and 41 relation types, with their textual attributes and image references), the Washi QA benchmark (2,092 question–answer items with their reference answers, supporting graph evidence and development/test split), the image files supplied with them, the image manifest, and any copy, subset or modification of any of these.</w:t>
+      </w:r>
+    </w:p>
+    <w:p>
+      <w:pPr>
+        <w:tabs>
+          <w:tab w:pos="567" w:val="left"/>
+        </w:tabs>
+        <w:spacing w:before="0" w:after="80" w:line="276" w:lineRule="auto"/>
+        <w:ind w:left="567" w:hanging="567"/>
+        <w:jc w:val="both"/>
+      </w:pPr>
+      <w:r>
+        <w:t>1.3</w:t>
+        <w:tab/>
+        <w:t>“Supplied Images” means the 255 image files included in the Dataset, of which 213 were recorded by the authors or provided by their collaborators and 42 were obtained from Wikimedia Commons.</w:t>
+      </w:r>
+    </w:p>
+    <w:p>
+      <w:pPr>
+        <w:tabs>
+          <w:tab w:pos="567" w:val="left"/>
+        </w:tabs>
+        <w:spacing w:before="0" w:after="80" w:line="276" w:lineRule="auto"/>
+        <w:ind w:left="567" w:hanging="567"/>
+        <w:jc w:val="both"/>
+      </w:pPr>
+      <w:r>
+        <w:t>1.4</w:t>
+        <w:tab/>
+        <w:t>“Third-Party Images” means the 355 images referenced in the image manifest that are not supplied with the Dataset because their rights belong to third parties.</w:t>
+      </w:r>
+    </w:p>
+    <w:p>
+      <w:pPr>
+        <w:tabs>
+          <w:tab w:pos="567" w:val="left"/>
+        </w:tabs>
+        <w:spacing w:before="0" w:after="80" w:line="276" w:lineRule="auto"/>
+        <w:ind w:left="567" w:hanging="567"/>
+        <w:jc w:val="both"/>
+      </w:pPr>
+      <w:r>
+        <w:t>1.5</w:t>
+        <w:tab/>
+        <w:t>“Research Group” means the Recipient and the persons named in the Recipient Information who work under the Recipient’s direction.</w:t>
+      </w:r>
+    </w:p>
+    <w:p>
+      <w:pPr>
+        <w:tabs>
+          <w:tab w:pos="567" w:val="left"/>
+        </w:tabs>
+        <w:spacing w:before="0" w:after="80" w:line="276" w:lineRule="auto"/>
+        <w:ind w:left="567" w:hanging="567"/>
+        <w:jc w:val="both"/>
+      </w:pPr>
+      <w:r>
+        <w:t>1.6</w:t>
+        <w:tab/>
+        <w:t>“Derived Results” means results, statistics, figures, analyses and models produced through use of the Dataset that do not reproduce the Dataset or a substantial part of it.</w:t>
+      </w:r>
+    </w:p>
+    <w:p>
+      <w:pPr>
+        <w:spacing w:before="160" w:after="80" w:line="276" w:lineRule="auto"/>
+        <w:jc w:val="left"/>
       </w:pPr>
       <w:r>
         <w:rPr>
           <w:b/>
+          <w:i w:val="0"/>
+          <w:caps w:val="0"/>
         </w:rPr>
-        <w:t>Recipient:</w:t>
-      </w:r>
-      <w:r>
-        <w:t xml:space="preserve"> the individual named in Section 9 ("the Recipient"), acting on behalf of the institution named there.</w:t>
+        <w:t>Article 2   Grant of Access</w:t>
       </w:r>
     </w:p>
     <w:p>
       <w:pPr>
-        <w:pStyle w:val="Heading1"/>
+        <w:tabs>
+          <w:tab w:pos="567" w:val="left"/>
+        </w:tabs>
+        <w:spacing w:before="0" w:after="80" w:line="276" w:lineRule="auto"/>
+        <w:ind w:left="567" w:hanging="567"/>
+        <w:jc w:val="both"/>
       </w:pPr>
       <w:r>
-        <w:t>1. What the dataset contains</w:t>
+        <w:t>2.1</w:t>
+        <w:tab/>
+        <w:t>Subject to the terms of this Agreement, the Data Provider grants the Recipient a non-exclusive, non-transferable, revocable and royalty-free right to use the Dataset for the purpose stated in Article 3.</w:t>
       </w:r>
     </w:p>
     <w:p>
       <w:pPr>
-        <w:spacing w:after="120"/>
+        <w:tabs>
+          <w:tab w:pos="567" w:val="left"/>
+        </w:tabs>
+        <w:spacing w:before="0" w:after="80" w:line="276" w:lineRule="auto"/>
+        <w:ind w:left="567" w:hanging="567"/>
+        <w:jc w:val="both"/>
       </w:pPr>
       <w:r>
-        <w:t>1.1 The knowledge graph WashiMMKG: 2,683 entities, 5,276 relations and 41 relation types, with textual attributes and 610 image references.</w:t>
+        <w:t>2.2</w:t>
+        <w:tab/>
+        <w:t>Access to the Dataset does not transfer any ownership, copyright or other right in the Dataset or in any image to the Recipient.</w:t>
       </w:r>
     </w:p>
     <w:p>
       <w:pPr>
-        <w:spacing w:after="120"/>
+        <w:spacing w:before="160" w:after="80" w:line="276" w:lineRule="auto"/>
+        <w:jc w:val="left"/>
       </w:pPr>
       <w:r>
-        <w:t>1.2 The Washi QA benchmark: 2,092 question–answer items with their reference answers, supporting graph evidence and the development/test split.</w:t>
+        <w:rPr>
+          <w:b/>
+          <w:i w:val="0"/>
+          <w:caps w:val="0"/>
+        </w:rPr>
+        <w:t>Article 3   Permitted Use</w:t>
       </w:r>
     </w:p>
     <w:p>
       <w:pPr>
-        <w:spacing w:after="120"/>
+        <w:tabs>
+          <w:tab w:pos="567" w:val="left"/>
+        </w:tabs>
+        <w:spacing w:before="0" w:after="80" w:line="276" w:lineRule="auto"/>
+        <w:ind w:left="567" w:hanging="567"/>
+        <w:jc w:val="both"/>
       </w:pPr>
       <w:r>
-        <w:t>1.3 Image files for 255 of the 610 images: 213 recorded by the authors or provided by their collaborators in Echizen, and 42 from Wikimedia Commons, each under its own licence as listed in the image manifest.</w:t>
+        <w:t>3.1</w:t>
+        <w:tab/>
+        <w:t>The Recipient shall use the Dataset solely for non-commercial academic research and teaching, including reproducing the results reported in the Publication and evaluating other methods on the benchmark.</w:t>
       </w:r>
     </w:p>
     <w:p>
       <w:pPr>
-        <w:spacing w:after="120"/>
+        <w:tabs>
+          <w:tab w:pos="567" w:val="left"/>
+        </w:tabs>
+        <w:spacing w:before="0" w:after="80" w:line="276" w:lineRule="auto"/>
+        <w:ind w:left="567" w:hanging="567"/>
+        <w:jc w:val="both"/>
       </w:pPr>
       <w:r>
-        <w:t xml:space="preserve">1.4 An image manifest listing, for each of the remaining 355 images, the website or publication it was collected from. These files are </w:t>
-      </w:r>
-      <w:r>
-        <w:rPr>
-          <w:b/>
-        </w:rPr>
-        <w:t>not</w:t>
-      </w:r>
-      <w:r>
-        <w:t xml:space="preserve"> included: they belong to third parties, and the Recipient obtains them, if at all, from those sources under those sources' terms.</w:t>
+        <w:t>3.2</w:t>
+        <w:tab/>
+        <w:t>The Recipient may publish Derived Results and may reproduce individual benchmark items or graph facts as illustrative examples in scholarly publications, subject to Article 7.</w:t>
       </w:r>
     </w:p>
     <w:p>
       <w:pPr>
-        <w:pStyle w:val="Heading1"/>
+        <w:spacing w:before="160" w:after="80" w:line="276" w:lineRule="auto"/>
+        <w:jc w:val="left"/>
       </w:pPr>
       <w:r>
-        <w:t>2. Permitted use</w:t>
+        <w:rPr>
+          <w:b/>
+          <w:i w:val="0"/>
+          <w:caps w:val="0"/>
+        </w:rPr>
+        <w:t>Article 4   Restrictions</w:t>
       </w:r>
     </w:p>
     <w:p>
       <w:pPr>
-        <w:spacing w:after="120"/>
+        <w:tabs>
+          <w:tab w:pos="567" w:val="left"/>
+        </w:tabs>
+        <w:spacing w:before="0" w:after="80" w:line="276" w:lineRule="auto"/>
+        <w:ind w:left="567" w:hanging="567"/>
+        <w:jc w:val="both"/>
       </w:pPr>
       <w:r>
-        <w:t>2.1 The Recipient may use the dataset only for non-commercial academic research and teaching, including reproducing the results of the paper and evaluating other methods on the benchmark.</w:t>
+        <w:t>4.1</w:t>
+        <w:tab/>
+        <w:t>The Recipient shall not distribute, publish, sell, sublicense, deposit in any repository or otherwise make available the Dataset or any substantial part of it to any person outside the Research Group. Any other group wishing to use the Dataset shall enter into its own agreement with the Data Provider.</w:t>
       </w:r>
     </w:p>
     <w:p>
       <w:pPr>
-        <w:spacing w:after="120"/>
+        <w:tabs>
+          <w:tab w:pos="567" w:val="left"/>
+        </w:tabs>
+        <w:spacing w:before="0" w:after="80" w:line="276" w:lineRule="auto"/>
+        <w:ind w:left="567" w:hanging="567"/>
+        <w:jc w:val="both"/>
       </w:pPr>
       <w:r>
-        <w:t>2.2 The Recipient may publish results, statistics, models and analyses derived from the dataset, and may quote individual items (questions, answers, graph facts) as examples in publications, with the citation required in Section 5.</w:t>
+        <w:t>4.2</w:t>
+        <w:tab/>
+        <w:t>The Recipient shall not use the Dataset, or any model trained on it, for commercial purposes or in the development of products or services offered for sale.</w:t>
       </w:r>
     </w:p>
     <w:p>
       <w:pPr>
-        <w:pStyle w:val="Heading1"/>
+        <w:tabs>
+          <w:tab w:pos="567" w:val="left"/>
+        </w:tabs>
+        <w:spacing w:before="0" w:after="80" w:line="276" w:lineRule="auto"/>
+        <w:ind w:left="567" w:hanging="567"/>
+        <w:jc w:val="both"/>
       </w:pPr>
       <w:r>
-        <w:t>3. Restrictions</w:t>
+        <w:t>4.3</w:t>
+        <w:tab/>
+        <w:t>The Recipient shall use each Wikimedia Commons image only in accordance with the licence recorded for it in the image manifest.</w:t>
       </w:r>
     </w:p>
     <w:p>
       <w:pPr>
-        <w:spacing w:after="120"/>
+        <w:tabs>
+          <w:tab w:pos="567" w:val="left"/>
+        </w:tabs>
+        <w:spacing w:before="0" w:after="80" w:line="276" w:lineRule="auto"/>
+        <w:ind w:left="567" w:hanging="567"/>
+        <w:jc w:val="both"/>
       </w:pPr>
       <w:r>
-        <w:t>3.1 The Recipient shall not redistribute the dataset or any substantial part of it, publish it, deposit it in a repository, or make it available to anyone outside the Recipient's research group. Each group that wishes to use the dataset must sign its own copy of this agreement.</w:t>
+        <w:t>4.4</w:t>
+        <w:tab/>
+        <w:t>The Recipient shall obtain any Third-Party Image only from its original source and under that source’s terms, and nothing in this Agreement grants any right in a Third-Party Image.</w:t>
       </w:r>
     </w:p>
     <w:p>
       <w:pPr>
-        <w:spacing w:after="120"/>
+        <w:tabs>
+          <w:tab w:pos="567" w:val="left"/>
+        </w:tabs>
+        <w:spacing w:before="0" w:after="80" w:line="276" w:lineRule="auto"/>
+        <w:ind w:left="567" w:hanging="567"/>
+        <w:jc w:val="both"/>
       </w:pPr>
       <w:r>
-        <w:t>3.2 The Recipient shall not use the dataset, or models trained on it, for commercial purposes, and shall not use it to develop products or services offered for sale.</w:t>
+        <w:t>4.5</w:t>
+        <w:tab/>
+        <w:t>The Recipient shall not remove or alter the source records attached to the graph, the benchmark or the images.</w:t>
       </w:r>
     </w:p>
     <w:p>
       <w:pPr>
-        <w:spacing w:after="120"/>
+        <w:spacing w:before="160" w:after="80" w:line="276" w:lineRule="auto"/>
+        <w:jc w:val="left"/>
       </w:pPr>
       <w:r>
-        <w:t>3.3 Some of the 213 authors' and collaborators' images show identifiable people. The Recipient shall not publish, display or redistribute these images, shall not attempt to identify the people shown, and shall handle them in accordance with the personal-data law applicable to the Recipient and to Japan.</w:t>
+        <w:rPr>
+          <w:b/>
+          <w:i w:val="0"/>
+          <w:caps w:val="0"/>
+        </w:rPr>
+        <w:t>Article 5   Personal Information</w:t>
       </w:r>
     </w:p>
     <w:p>
       <w:pPr>
-        <w:spacing w:after="120"/>
+        <w:tabs>
+          <w:tab w:pos="567" w:val="left"/>
+        </w:tabs>
+        <w:spacing w:before="0" w:after="80" w:line="276" w:lineRule="auto"/>
+        <w:ind w:left="567" w:hanging="567"/>
+        <w:jc w:val="both"/>
       </w:pPr>
       <w:r>
-        <w:t>3.4 The 42 Wikimedia Commons images may be reused only under their respective licences, which are recorded in the image manifest together with each author's name.</w:t>
+        <w:t>5.1</w:t>
+        <w:tab/>
+        <w:t>Some Supplied Images show identifiable individuals. The Recipient shall not publish, display or distribute such images, shall not attempt to identify the individuals shown, and shall process such images in compliance with the personal information protection laws of Japan and of the Recipient’s jurisdiction.</w:t>
       </w:r>
     </w:p>
     <w:p>
       <w:pPr>
-        <w:spacing w:after="120"/>
+        <w:spacing w:before="160" w:after="80" w:line="276" w:lineRule="auto"/>
+        <w:jc w:val="left"/>
       </w:pPr>
       <w:r>
-        <w:t>3.5 The Recipient shall not remove or alter the source records that accompany the graph, the benchmark or the images.</w:t>
+        <w:rPr>
+          <w:b/>
+          <w:i w:val="0"/>
+          <w:caps w:val="0"/>
+        </w:rPr>
+        <w:t>Article 6   Security and Destruction</w:t>
       </w:r>
     </w:p>
     <w:p>
       <w:pPr>
-        <w:pStyle w:val="Heading1"/>
+        <w:tabs>
+          <w:tab w:pos="567" w:val="left"/>
+        </w:tabs>
+        <w:spacing w:before="0" w:after="80" w:line="276" w:lineRule="auto"/>
+        <w:ind w:left="567" w:hanging="567"/>
+        <w:jc w:val="both"/>
       </w:pPr>
       <w:r>
-        <w:t>4. Storage and deletion</w:t>
+        <w:t>6.1</w:t>
+        <w:tab/>
+        <w:t>The Recipient shall store the Dataset on systems controlled by the Recipient’s institution, with access restricted to members of the Research Group.</w:t>
       </w:r>
     </w:p>
     <w:p>
       <w:pPr>
-        <w:spacing w:after="120"/>
+        <w:tabs>
+          <w:tab w:pos="567" w:val="left"/>
+        </w:tabs>
+        <w:spacing w:before="0" w:after="80" w:line="276" w:lineRule="auto"/>
+        <w:ind w:left="567" w:hanging="567"/>
+        <w:jc w:val="both"/>
       </w:pPr>
       <w:r>
-        <w:t>4.1 The Recipient shall store the dataset on systems under the Recipient's institution's control with access limited to members of the research group who need it.</w:t>
+        <w:t>6.2</w:t>
+        <w:tab/>
+        <w:t>The Recipient shall destroy all copies of the Dataset, including the Supplied Images, upon completion of the research project identified in the Recipient Information, upon termination of this Agreement, or within thirty (30) days of a written request by the Data Provider, whichever occurs first, and shall confirm such destruction in writing upon request.</w:t>
       </w:r>
     </w:p>
     <w:p>
       <w:pPr>
-        <w:spacing w:after="120"/>
+        <w:spacing w:before="160" w:after="80" w:line="276" w:lineRule="auto"/>
+        <w:jc w:val="left"/>
       </w:pPr>
       <w:r>
-        <w:t>4.2 The Recipient shall delete all copies of the dataset, including the images, at the end of the research project named in Section 9, on termination of this agreement, or within 30 days of a written request from the Provider, and shall confirm the deletion on request.</w:t>
+        <w:rPr>
+          <w:b/>
+          <w:i w:val="0"/>
+          <w:caps w:val="0"/>
+        </w:rPr>
+        <w:t>Article 7   Attribution</w:t>
       </w:r>
     </w:p>
     <w:p>
       <w:pPr>
-        <w:pStyle w:val="Heading1"/>
+        <w:tabs>
+          <w:tab w:pos="567" w:val="left"/>
+        </w:tabs>
+        <w:spacing w:before="0" w:after="80" w:line="276" w:lineRule="auto"/>
+        <w:ind w:left="567" w:hanging="567"/>
+        <w:jc w:val="both"/>
       </w:pPr>
       <w:r>
-        <w:t>5. Attribution</w:t>
+        <w:t>7.1</w:t>
+        <w:tab/>
+        <w:t>Any publication, presentation or software that makes use of the Dataset shall cite the Publication.</w:t>
       </w:r>
     </w:p>
     <w:p>
       <w:pPr>
-        <w:spacing w:after="120"/>
+        <w:spacing w:before="160" w:after="80" w:line="276" w:lineRule="auto"/>
+        <w:jc w:val="left"/>
       </w:pPr>
       <w:r>
-        <w:t>Any publication, presentation or software that uses the dataset shall cite the paper named above. Where the dataset is acknowledged, it should be referred to as "WashiMMKG and the Washi QA benchmark, provided by the authors".</w:t>
+        <w:rPr>
+          <w:b/>
+          <w:i w:val="0"/>
+          <w:caps w:val="0"/>
+        </w:rPr>
+        <w:t>Article 8   Disclaimer and Limitation of Liability</w:t>
       </w:r>
     </w:p>
     <w:p>
       <w:pPr>
-        <w:pStyle w:val="Heading1"/>
+        <w:tabs>
+          <w:tab w:pos="567" w:val="left"/>
+        </w:tabs>
+        <w:spacing w:before="0" w:after="80" w:line="276" w:lineRule="auto"/>
+        <w:ind w:left="567" w:hanging="567"/>
+        <w:jc w:val="both"/>
       </w:pPr>
       <w:r>
-        <w:t>6. No warranty</w:t>
+        <w:t>8.1</w:t>
+        <w:tab/>
+        <w:t>The Dataset is provided “as is”. The knowledge graph and the benchmark were constructed with the assistance of large language models and may contain errors of extraction, entity alignment, translation or description. The Data Provider makes no warranty, express or implied, as to the accuracy, completeness or fitness for a particular purpose of the Dataset.</w:t>
       </w:r>
     </w:p>
     <w:p>
       <w:pPr>
-        <w:spacing w:after="120"/>
+        <w:tabs>
+          <w:tab w:pos="567" w:val="left"/>
+        </w:tabs>
+        <w:spacing w:before="0" w:after="80" w:line="276" w:lineRule="auto"/>
+        <w:ind w:left="567" w:hanging="567"/>
+        <w:jc w:val="both"/>
       </w:pPr>
       <w:r>
-        <w:t>The dataset is provided as is. The graph and the benchmark were built with the assistance of large language models and, although they were reviewed, may contain errors in extraction, entity alignment, translation or captioning. The Provider makes no warranty as to accuracy, completeness or fitness for any purpose, and accepts no liability for any use of the dataset.</w:t>
+        <w:t>8.2</w:t>
+        <w:tab/>
+        <w:t>The Data Provider shall not be liable for any damage arising from the use of the Dataset. The Recipient shall be responsible for all use of the Dataset by members of the Research Group.</w:t>
       </w:r>
     </w:p>
     <w:p>
       <w:pPr>
-        <w:pStyle w:val="Heading1"/>
+        <w:spacing w:before="160" w:after="80" w:line="276" w:lineRule="auto"/>
+        <w:jc w:val="left"/>
       </w:pPr>
       <w:r>
-        <w:t>7. Term and termination</w:t>
+        <w:rPr>
+          <w:b/>
+          <w:i w:val="0"/>
+          <w:caps w:val="0"/>
+        </w:rPr>
+        <w:t>Article 9   Term and Termination</w:t>
       </w:r>
     </w:p>
     <w:p>
       <w:pPr>
-        <w:spacing w:after="120"/>
+        <w:tabs>
+          <w:tab w:pos="567" w:val="left"/>
+        </w:tabs>
+        <w:spacing w:before="0" w:after="80" w:line="276" w:lineRule="auto"/>
+        <w:ind w:left="567" w:hanging="567"/>
+        <w:jc w:val="both"/>
       </w:pPr>
       <w:r>
-        <w:t>7.1 This agreement takes effect when the Provider countersigns it and lasts for three years, or until the end of the research project named in Section 9 if that comes first. It may be renewed on request.</w:t>
+        <w:t>9.1</w:t>
+        <w:tab/>
+        <w:t>This Agreement shall take effect on the date on which the Data Provider grants access to the Dataset following receipt of this Agreement signed by the Recipient, and shall remain in force for three (3) years or until completion of the research project identified in the Recipient Information, whichever occurs first. It may be renewed by written agreement.</w:t>
       </w:r>
     </w:p>
     <w:p>
       <w:pPr>
-        <w:spacing w:after="120"/>
+        <w:tabs>
+          <w:tab w:pos="567" w:val="left"/>
+        </w:tabs>
+        <w:spacing w:before="0" w:after="80" w:line="276" w:lineRule="auto"/>
+        <w:ind w:left="567" w:hanging="567"/>
+        <w:jc w:val="both"/>
       </w:pPr>
       <w:r>
-        <w:t>7.2 The Provider may terminate the agreement immediately by written notice if the Recipient breaches it. Sections 3, 4, 5 and 6 survive termination.</w:t>
+        <w:t>9.2</w:t>
+        <w:tab/>
+        <w:t>The Data Provider may terminate this Agreement with immediate effect by written notice if the Recipient breaches any of its terms.</w:t>
       </w:r>
     </w:p>
     <w:p>
       <w:pPr>
-        <w:pStyle w:val="Heading1"/>
+        <w:tabs>
+          <w:tab w:pos="567" w:val="left"/>
+        </w:tabs>
+        <w:spacing w:before="0" w:after="80" w:line="276" w:lineRule="auto"/>
+        <w:ind w:left="567" w:hanging="567"/>
+        <w:jc w:val="both"/>
       </w:pPr>
       <w:r>
-        <w:t>8. General</w:t>
+        <w:t>9.3</w:t>
+        <w:tab/>
+        <w:t>Articles 4, 5, 6, 7 and 8 shall survive termination or expiry of this Agreement.</w:t>
       </w:r>
     </w:p>
     <w:p>
       <w:pPr>
-        <w:spacing w:after="120"/>
+        <w:spacing w:before="160" w:after="80" w:line="276" w:lineRule="auto"/>
+        <w:jc w:val="left"/>
       </w:pPr>
       <w:r>
-        <w:t>8.1 This agreement is governed by the laws of Japan.</w:t>
+        <w:rPr>
+          <w:b/>
+          <w:i w:val="0"/>
+          <w:caps w:val="0"/>
+        </w:rPr>
+        <w:t>Article 10   Governing Law and Jurisdiction</w:t>
       </w:r>
     </w:p>
     <w:p>
       <w:pPr>
-        <w:spacing w:after="120"/>
+        <w:tabs>
+          <w:tab w:pos="567" w:val="left"/>
+        </w:tabs>
+        <w:spacing w:before="0" w:after="80" w:line="276" w:lineRule="auto"/>
+        <w:ind w:left="567" w:hanging="567"/>
+        <w:jc w:val="both"/>
       </w:pPr>
       <w:r>
-        <w:t>8.2 Changes to this agreement are valid only in writing and signed by both parties.</w:t>
+        <w:t>10.1</w:t>
+        <w:tab/>
+        <w:t>This Agreement shall be governed by the laws of Japan. Any dispute arising out of or in connection with this Agreement shall be submitted to the exclusive jurisdiction of the Osaka District Court.</w:t>
       </w:r>
     </w:p>
     <w:p>
       <w:pPr>
-        <w:pStyle w:val="Heading1"/>
+        <w:spacing w:before="160" w:after="80" w:line="276" w:lineRule="auto"/>
+        <w:jc w:val="left"/>
       </w:pPr>
       <w:r>
-        <w:t>9. Recipient and project</w:t>
+        <w:rPr>
+          <w:b/>
+          <w:i w:val="0"/>
+          <w:caps w:val="0"/>
+        </w:rPr>
+        <w:t>Article 11   Entire Agreement</w:t>
+      </w:r>
+    </w:p>
+    <w:p>
+      <w:pPr>
+        <w:tabs>
+          <w:tab w:pos="567" w:val="left"/>
+        </w:tabs>
+        <w:spacing w:before="0" w:after="80" w:line="276" w:lineRule="auto"/>
+        <w:ind w:left="567" w:hanging="567"/>
+        <w:jc w:val="both"/>
+      </w:pPr>
+      <w:r>
+        <w:t>11.1</w:t>
+        <w:tab/>
+        <w:t>This Agreement constitutes the entire agreement concerning the Dataset and supersedes any prior understanding. Any amendment shall be valid only if made in writing.</w:t>
+      </w:r>
+    </w:p>
+    <w:p>
+      <w:pPr>
+        <w:spacing w:before="280" w:after="120" w:line="276" w:lineRule="auto"/>
+        <w:jc w:val="left"/>
+      </w:pPr>
+      <w:r>
+        <w:rPr>
+          <w:b/>
+          <w:i w:val="0"/>
+          <w:caps w:val="0"/>
+        </w:rPr>
+        <w:t>Recipient Information</w:t>
       </w:r>
     </w:p>
     <w:tbl>
       <w:tblPr>
         <w:tblStyle w:val="TableGrid"/>
         <w:tblW w:type="auto" w:w="0"/>
+        <w:jc w:val="center"/>
         <w:tblLook w:firstColumn="1" w:firstRow="1" w:lastColumn="0" w:lastRow="0" w:noHBand="0" w:noVBand="1" w:val="04A0"/>
       </w:tblPr>
       <w:tblGrid>
-        <w:gridCol w:w="4873"/>
-        <w:gridCol w:w="4873"/>
+        <w:gridCol w:w="4536"/>
+        <w:gridCol w:w="4536"/>
       </w:tblGrid>
       <w:tr>
         <w:tc>
           <w:tcPr>
-            <w:tcW w:type="dxa" w:w="3685"/>
+            <w:tcW w:type="dxa" w:w="3288"/>
           </w:tcPr>
           <w:p>
             <w:r>
-              <w:t>Recipient (full name)</w:t>
+              <w:rPr>
+                <w:b/>
+                <w:sz w:val="20"/>
+              </w:rPr>
+              <w:t>Full name</w:t>
             </w:r>
           </w:p>
         </w:tc>
         <w:tc>
           <w:tcPr>
-            <w:tcW w:type="dxa" w:w="5669"/>
+            <w:tcW w:type="dxa" w:w="5783"/>
           </w:tcPr>
           <w:p>
             <w:pPr>
-              <w:spacing w:after="360"/>
+              <w:spacing w:after="200"/>
             </w:pPr>
-            <w:r/>
           </w:p>
         </w:tc>
       </w:tr>
       <w:tr>
         <w:tc>
           <w:tcPr>
-            <w:tcW w:type="dxa" w:w="3685"/>
+            <w:tcW w:type="dxa" w:w="3288"/>
           </w:tcPr>
           <w:p>
             <w:r>
+              <w:rPr>
+                <w:b/>
+                <w:sz w:val="20"/>
+              </w:rPr>
               <w:t>Position</w:t>
             </w:r>
           </w:p>
         </w:tc>
         <w:tc>
           <w:tcPr>
-            <w:tcW w:type="dxa" w:w="5669"/>
+            <w:tcW w:type="dxa" w:w="5783"/>
           </w:tcPr>
           <w:p>
             <w:pPr>
-              <w:spacing w:after="360"/>
+              <w:spacing w:after="200"/>
             </w:pPr>
-            <w:r/>
           </w:p>
         </w:tc>
       </w:tr>
       <w:tr>
         <w:tc>
           <w:tcPr>
-            <w:tcW w:type="dxa" w:w="3685"/>
+            <w:tcW w:type="dxa" w:w="3288"/>
           </w:tcPr>
           <w:p>
             <w:r>
+              <w:rPr>
+                <w:b/>
+                <w:sz w:val="20"/>
+              </w:rPr>
               <w:t>Institution and department</w:t>
             </w:r>
           </w:p>
         </w:tc>
         <w:tc>
           <w:tcPr>
-            <w:tcW w:type="dxa" w:w="5669"/>
+            <w:tcW w:type="dxa" w:w="5783"/>
           </w:tcPr>
           <w:p>
             <w:pPr>
-              <w:spacing w:after="360"/>
+              <w:spacing w:after="200"/>
             </w:pPr>
-            <w:r/>
           </w:p>
         </w:tc>
       </w:tr>
       <w:tr>
         <w:tc>
           <w:tcPr>
-            <w:tcW w:type="dxa" w:w="3685"/>
+            <w:tcW w:type="dxa" w:w="3288"/>
           </w:tcPr>
           <w:p>
             <w:r>
-              <w:t>Institutional e-mail</w:t>
+              <w:rPr>
+                <w:b/>
+                <w:sz w:val="20"/>
+              </w:rPr>
+              <w:t>Institutional e-mail address</w:t>
             </w:r>
           </w:p>
         </w:tc>
         <w:tc>
           <w:tcPr>
-            <w:tcW w:type="dxa" w:w="5669"/>
+            <w:tcW w:type="dxa" w:w="5783"/>
           </w:tcPr>
           <w:p>
             <w:pPr>
-              <w:spacing w:after="360"/>
+              <w:spacing w:after="200"/>
             </w:pPr>
-            <w:r/>
           </w:p>
         </w:tc>
       </w:tr>
       <w:tr>
         <w:tc>
           <w:tcPr>
-            <w:tcW w:type="dxa" w:w="3685"/>
+            <w:tcW w:type="dxa" w:w="3288"/>
           </w:tcPr>
           <w:p>
             <w:r>
-              <w:t>Research project (title and expected end date)</w:t>
+              <w:rPr>
+                <w:b/>
+                <w:sz w:val="20"/>
+              </w:rPr>
+              <w:t>Research project (title)</w:t>
             </w:r>
           </w:p>
         </w:tc>
         <w:tc>
           <w:tcPr>
-            <w:tcW w:type="dxa" w:w="5669"/>
+            <w:tcW w:type="dxa" w:w="5783"/>
           </w:tcPr>
           <w:p>
             <w:pPr>
-              <w:spacing w:after="360"/>
+              <w:spacing w:after="200"/>
             </w:pPr>
-            <w:r/>
           </w:p>
         </w:tc>
       </w:tr>
       <w:tr>
         <w:tc>
           <w:tcPr>
-            <w:tcW w:type="dxa" w:w="3685"/>
+            <w:tcW w:type="dxa" w:w="3288"/>
           </w:tcPr>
           <w:p>
             <w:r>
-              <w:t>Members of the research group who will access the data</w:t>
+              <w:rPr>
+                <w:b/>
+                <w:sz w:val="20"/>
+              </w:rPr>
+              <w:t>Expected completion date of the project</w:t>
             </w:r>
           </w:p>
         </w:tc>
         <w:tc>
           <w:tcPr>
-            <w:tcW w:type="dxa" w:w="5669"/>
+            <w:tcW w:type="dxa" w:w="5783"/>
           </w:tcPr>
           <w:p>
             <w:pPr>
-              <w:spacing w:after="360"/>
+              <w:spacing w:after="200"/>
             </w:pPr>
-            <w:r/>
           </w:p>
         </w:tc>
       </w:tr>
       <w:tr>
         <w:tc>
           <w:tcPr>
-            <w:tcW w:type="dxa" w:w="3685"/>
+            <w:tcW w:type="dxa" w:w="3288"/>
           </w:tcPr>
           <w:p>
             <w:r>
-              <w:t>Intended use (2–3 sentences)</w:t>
+              <w:rPr>
+                <w:b/>
+                <w:sz w:val="20"/>
+              </w:rPr>
+              <w:t>Members of the Research Group</w:t>
             </w:r>
           </w:p>
         </w:tc>
         <w:tc>
           <w:tcPr>
-            <w:tcW w:type="dxa" w:w="5669"/>
+            <w:tcW w:type="dxa" w:w="5783"/>
           </w:tcPr>
           <w:p>
             <w:pPr>
-              <w:spacing w:after="360"/>
+              <w:spacing w:after="440"/>
             </w:pPr>
-            <w:r/>
+          </w:p>
+        </w:tc>
+      </w:tr>
+      <w:tr>
+        <w:tc>
+          <w:tcPr>
+            <w:tcW w:type="dxa" w:w="3288"/>
+          </w:tcPr>
+          <w:p>
+            <w:r>
+              <w:rPr>
+                <w:b/>
+                <w:sz w:val="20"/>
+              </w:rPr>
+              <w:t>Intended use of the Dataset</w:t>
+            </w:r>
+          </w:p>
+        </w:tc>
+        <w:tc>
+          <w:tcPr>
+            <w:tcW w:type="dxa" w:w="5783"/>
+          </w:tcPr>
+          <w:p>
+            <w:pPr>
+              <w:spacing w:after="440"/>
+            </w:pPr>
           </w:p>
         </w:tc>
       </w:tr>
     </w:tbl>
     <w:p>
       <w:pPr>
-        <w:pStyle w:val="Heading1"/>
+        <w:spacing w:before="0" w:after="120" w:line="276" w:lineRule="auto"/>
+        <w:jc w:val="both"/>
+      </w:pPr>
+    </w:p>
+    <w:p>
+      <w:pPr>
+        <w:spacing w:before="160" w:after="520" w:line="276" w:lineRule="auto"/>
+        <w:jc w:val="both"/>
       </w:pPr>
       <w:r>
-        <w:t>10. Signatures</w:t>
+        <w:rPr>
+          <w:b w:val="0"/>
+          <w:i w:val="0"/>
+          <w:caps w:val="0"/>
+        </w:rPr>
+        <w:t>By signing below, the Recipient confirms that the Recipient has read and understood this Agreement and agrees to be bound by its terms, and that the information given above is accurate.</w:t>
       </w:r>
     </w:p>
     <w:p>
       <w:pPr>
-        <w:spacing w:after="120"/>
+        <w:tabs>
+          <w:tab w:pos="2268" w:val="left"/>
+        </w:tabs>
+        <w:spacing w:before="0" w:after="400" w:line="276" w:lineRule="auto"/>
+        <w:jc w:val="left"/>
       </w:pPr>
       <w:r>
         <w:rPr>
           <w:b/>
         </w:rPr>
-        <w:t>Recipient</w:t>
+        <w:t>Signature:</w:t>
+      </w:r>
+      <w:r>
+        <w:tab/>
+        <w:t>_____________________________________________</w:t>
       </w:r>
     </w:p>
     <w:p>
       <w:pPr>
-        <w:spacing w:after="120"/>
-      </w:pPr>
-      <w:r>
-        <w:t>Signature: ______________________________   Date: ______________</w:t>
-      </w:r>
-    </w:p>
-    <w:p>
-      <w:pPr>
-        <w:spacing w:after="120"/>
+        <w:tabs>
+          <w:tab w:pos="2268" w:val="left"/>
+        </w:tabs>
+        <w:spacing w:before="0" w:after="400" w:line="276" w:lineRule="auto"/>
+        <w:jc w:val="left"/>
       </w:pPr>
       <w:r>
         <w:rPr>
           <w:b/>
         </w:rPr>
-        <w:t>Provider</w:t>
+        <w:t>Name (printed):</w:t>
+      </w:r>
+      <w:r>
+        <w:tab/>
+        <w:t>_____________________________________________</w:t>
       </w:r>
     </w:p>
     <w:p>
       <w:pPr>
-        <w:spacing w:after="120"/>
-      </w:pPr>
-      <w:r>
-        <w:t>Signature: ______________________________   Date: ______________</w:t>
-      </w:r>
-    </w:p>
-    <w:p>
-      <w:pPr>
-        <w:spacing w:after="120"/>
-      </w:pPr>
-      <w:r>
-        <w:t>Bowen Wang, SANKEN, The University of Osaka, 8-1 Mihogaoka, Ibaraki, Osaka 567-0047, Japan</w:t>
-      </w:r>
-    </w:p>
-    <w:p>
-      <w:r>
-        <w:t>____________________________________________________________</w:t>
-      </w:r>
-    </w:p>
-    <w:p>
-      <w:pPr>
-        <w:spacing w:after="120"/>
+        <w:tabs>
+          <w:tab w:pos="2268" w:val="left"/>
+        </w:tabs>
+        <w:spacing w:before="0" w:after="400" w:line="276" w:lineRule="auto"/>
+        <w:jc w:val="left"/>
       </w:pPr>
       <w:r>
         <w:rPr>
-          <w:i/>
+          <w:b/>
         </w:rPr>
-        <w:t>How to request the dataset:</w:t>
+        <w:t>Date:</w:t>
       </w:r>
       <w:r>
-        <w:t xml:space="preserve"> complete Sections 9 and 10, sign, and send the agreement as a PDF from your institutional e-mail address to wang@im.sanken.osaka-u.ac.jp. On countersignature the Provider will send a download link valid for 14 days.</w:t>
+        <w:tab/>
+        <w:t>_____________________________________________</w:t>
       </w:r>
     </w:p>
     <w:sectPr>
-      <w:pgSz w:w="12240" w:h="15840"/>
-      <w:pgMar w:top="1247" w:right="1247" w:bottom="1247" w:left="1247" w:header="720" w:footer="720" w:gutter="0"/>
+      <w:headerReference w:type="default" r:id="rId9"/>
+      <w:footerReference w:type="default" r:id="rId10"/>
+      <w:pgSz w:w="11906" w:h="16838"/>
+      <w:pgMar w:top="1304" w:right="1417" w:bottom="1304" w:left="1417" w:header="720" w:footer="720" w:gutter="0"/>
       <w:cols w:space="720"/>
       <w:docGrid w:linePitch="360"/>
     </w:sectPr>
   </w:body>
 </w:document>
+</file>
+
+<file path=word/footer1.xml><?xml version="1.0" encoding="utf-8"?>
+<w:ftr xmlns:m="http://schemas.openxmlformats.org/officeDocument/2006/math" xmlns:mc="http://schemas.openxmlformats.org/markup-compatibility/2006" xmlns:mo="http://schemas.microsoft.com/office/mac/office/2008/main" xmlns:mv="urn:schemas-microsoft-com:mac:vml" xmlns:o="urn:schemas-microsoft-com:office:office" xmlns:r="http://schemas.openxmlformats.org/officeDocument/2006/relationships" xmlns:v="urn:schemas-microsoft-com:vml" xmlns:w10="urn:schemas-microsoft-com:office:word" xmlns:w14="http://schemas.microsoft.com/office/word/2010/wordml" xmlns:w="http://schemas.openxmlformats.org/wordprocessingml/2006/main" xmlns:wne="http://schemas.microsoft.com/office/word/2006/wordml" xmlns:wp14="http://schemas.microsoft.com/office/word/2010/wordprocessingDrawing" xmlns:wp="http://schemas.openxmlformats.org/drawingml/2006/wordprocessingDrawing" xmlns:wpc="http://schemas.microsoft.com/office/word/2010/wordprocessingCanvas" xmlns:wpg="http://schemas.microsoft.com/office/word/2010/wordprocessingGroup" xmlns:wpi="http://schemas.microsoft.com/office/word/2010/wordprocessingInk" xmlns:wps="http://schemas.microsoft.com/office/word/2010/wordprocessingShape" mc:Ignorable="w14 wp14">
+  <w:p>
+    <w:pPr>
+      <w:pStyle w:val="Footer"/>
+      <w:jc w:val="center"/>
+    </w:pPr>
+    <w:r>
+      <w:rPr>
+        <w:sz w:val="18"/>
+      </w:rPr>
+      <w:t xml:space="preserve">Page </w:t>
+    </w:r>
+    <w:r>
+      <w:rPr>
+        <w:sz w:val="18"/>
+      </w:rPr>
+      <w:fldChar w:fldCharType="begin"/>
+      <w:instrText xml:space="preserve">PAGE</w:instrText>
+      <w:fldChar w:fldCharType="end"/>
+    </w:r>
+    <w:r>
+      <w:rPr>
+        <w:sz w:val="18"/>
+      </w:rPr>
+      <w:t xml:space="preserve"> of </w:t>
+    </w:r>
+    <w:r>
+      <w:rPr>
+        <w:sz w:val="18"/>
+      </w:rPr>
+      <w:fldChar w:fldCharType="begin"/>
+      <w:instrText xml:space="preserve">NUMPAGES</w:instrText>
+      <w:fldChar w:fldCharType="end"/>
+    </w:r>
+  </w:p>
+</w:ftr>
+</file>
+
+<file path=word/header1.xml><?xml version="1.0" encoding="utf-8"?>
+<w:hdr xmlns:m="http://schemas.openxmlformats.org/officeDocument/2006/math" xmlns:mc="http://schemas.openxmlformats.org/markup-compatibility/2006" xmlns:mo="http://schemas.microsoft.com/office/mac/office/2008/main" xmlns:mv="urn:schemas-microsoft-com:mac:vml" xmlns:o="urn:schemas-microsoft-com:office:office" xmlns:r="http://schemas.openxmlformats.org/officeDocument/2006/relationships" xmlns:v="urn:schemas-microsoft-com:vml" xmlns:w10="urn:schemas-microsoft-com:office:word" xmlns:w14="http://schemas.microsoft.com/office/word/2010/wordml" xmlns:w="http://schemas.openxmlformats.org/wordprocessingml/2006/main" xmlns:wne="http://schemas.microsoft.com/office/word/2006/wordml" xmlns:wp14="http://schemas.microsoft.com/office/word/2010/wordprocessingDrawing" xmlns:wp="http://schemas.openxmlformats.org/drawingml/2006/wordprocessingDrawing" xmlns:wpc="http://schemas.microsoft.com/office/word/2010/wordprocessingCanvas" xmlns:wpg="http://schemas.microsoft.com/office/word/2010/wordprocessingGroup" xmlns:wpi="http://schemas.microsoft.com/office/word/2010/wordprocessingInk" xmlns:wps="http://schemas.microsoft.com/office/word/2010/wordprocessingShape" mc:Ignorable="w14 wp14">
+  <w:p>
+    <w:pPr>
+      <w:pStyle w:val="Header"/>
+      <w:jc w:val="right"/>
+    </w:pPr>
+    <w:r>
+      <w:rPr>
+        <w:i/>
+        <w:sz w:val="18"/>
+      </w:rPr>
+      <w:t>WashiMMKG Data Use Agreement</w:t>
+    </w:r>
+  </w:p>
+</w:hdr>
 </file>
 
 <file path=word/numbering.xml><?xml version="1.0" encoding="utf-8"?>
@@ -914,7 +1352,7 @@
     <w:qFormat/>
     <w:rsid w:val="00FC693F"/>
     <w:rPr>
-      <w:rFonts w:ascii="Calibri" w:hAnsi="Calibri"/>
+      <w:rFonts w:ascii="Times New Roman" w:hAnsi="Times New Roman" w:eastAsia="Times New Roman"/>
       <w:sz w:val="22"/>
     </w:rPr>
   </w:style>

</xml_diff>